<commit_message>
docs: add current touch operation diagram
</commit_message>
<xml_diff>
--- a/documents/DeskSideClock_基本設計書_v2.4.0.docx
+++ b/documents/DeskSideClock_基本設計書_v2.4.0.docx
@@ -10868,6 +10868,54 @@
     </w:p>
     <w:p>
       <w:pPr>
+        <w:jc w:val="center"/>
+      </w:pPr>
+      <w:r>
+        <w:drawing>
+          <wp:inline xmlns:a="http://schemas.openxmlformats.org/drawingml/2006/main" xmlns:pic="http://schemas.openxmlformats.org/drawingml/2006/picture">
+            <wp:extent cx="5623560" cy="3163181"/>
+            <wp:docPr id="1" name="Picture 1" descr="DeskSideClock v2.4.0 タッチ操作領域と表示状態別の入力条件"/>
+            <wp:cNvGraphicFramePr>
+              <a:graphicFrameLocks noChangeAspect="1"/>
+            </wp:cNvGraphicFramePr>
+            <a:graphic>
+              <a:graphicData uri="http://schemas.openxmlformats.org/drawingml/2006/picture">
+                <pic:pic>
+                  <pic:nvPicPr>
+                    <pic:cNvPr id="0" name="touch_operation_layout_v2.4.0.png"/>
+                    <pic:cNvPicPr/>
+                  </pic:nvPicPr>
+                  <pic:blipFill>
+                    <a:blip r:embed="rId12"/>
+                    <a:stretch>
+                      <a:fillRect/>
+                    </a:stretch>
+                  </pic:blipFill>
+                  <pic:spPr>
+                    <a:xfrm>
+                      <a:off x="0" y="0"/>
+                      <a:ext cx="5623560" cy="3163181"/>
+                    </a:xfrm>
+                    <a:prstGeom prst="rect"/>
+                  </pic:spPr>
+                </pic:pic>
+              </a:graphicData>
+            </a:graphic>
+          </wp:inline>
+        </w:drawing>
+      </w:r>
+    </w:p>
+    <w:p>
+      <w:pPr>
+        <w:pStyle w:val="Caption"/>
+        <w:jc w:val="center"/>
+      </w:pPr>
+      <w:r>
+        <w:t>図10-1 タッチ操作領域（現行v2.4.0実装）</w:t>
+      </w:r>
+    </w:p>
+    <w:p>
+      <w:pPr>
         <w:pStyle w:val="Heading1"/>
         <w:keepNext/>
         <w:pageBreakBefore/>

</xml_diff>

<commit_message>
docs: base touch guide on Pi screen capture
</commit_message>
<xml_diff>
--- a/documents/DeskSideClock_基本設計書_v2.4.0.docx
+++ b/documents/DeskSideClock_基本設計書_v2.4.0.docx
@@ -10873,8 +10873,8 @@
       <w:r>
         <w:drawing>
           <wp:inline xmlns:a="http://schemas.openxmlformats.org/drawingml/2006/main" xmlns:pic="http://schemas.openxmlformats.org/drawingml/2006/picture">
-            <wp:extent cx="5623560" cy="3163181"/>
-            <wp:docPr id="1" name="Picture 1" descr="DeskSideClock v2.4.0 タッチ操作領域と表示状態別の入力条件"/>
+            <wp:extent cx="5623560" cy="3514725"/>
+            <wp:docPr id="1" name="Picture 1" descr="momoRB5 実機画面キャプチャに現在のタッチ操作領域を色分けして重ねた図"/>
             <wp:cNvGraphicFramePr>
               <a:graphicFrameLocks noChangeAspect="1"/>
             </wp:cNvGraphicFramePr>
@@ -10882,11 +10882,11 @@
               <a:graphicData uri="http://schemas.openxmlformats.org/drawingml/2006/picture">
                 <pic:pic>
                   <pic:nvPicPr>
-                    <pic:cNvPr id="0" name="touch_operation_layout_v2.4.0.png"/>
+                    <pic:cNvPr id="0" name="touch_operation_screen_v2.4.0.png"/>
                     <pic:cNvPicPr/>
                   </pic:nvPicPr>
                   <pic:blipFill>
-                    <a:blip r:embed="rId12"/>
+                    <a:blip r:embed="rId13"/>
                     <a:stretch>
                       <a:fillRect/>
                     </a:stretch>
@@ -10894,7 +10894,7 @@
                   <pic:spPr>
                     <a:xfrm>
                       <a:off x="0" y="0"/>
-                      <a:ext cx="5623560" cy="3163181"/>
+                      <a:ext cx="5623560" cy="3514725"/>
                     </a:xfrm>
                     <a:prstGeom prst="rect"/>
                   </pic:spPr>
@@ -10903,6 +10903,224 @@
             </a:graphic>
           </wp:inline>
         </w:drawing>
+      </w:r>
+    </w:p>
+    <w:p>
+      <w:pPr>
+        <w:pStyle w:val="Caption"/>
+        <w:jc w:val="center"/>
+      </w:pPr>
+      <w:r>
+        <w:t>図10-1 実機画面に基づくタッチ操作領域（v2.4.0）</w:t>
+      </w:r>
+    </w:p>
+    <w:tbl>
+      <w:tblPr>
+        <w:tblStyle w:val="TableGrid"/>
+        <w:tblW w:type="auto" w:w="0"/>
+        <w:jc w:val="center"/>
+        <w:tblLook w:firstColumn="1" w:firstRow="1" w:lastColumn="0" w:lastRow="0" w:noHBand="0" w:noVBand="1" w:val="04A0"/>
+      </w:tblPr>
+      <w:tblGrid>
+        <w:gridCol w:w="4910"/>
+        <w:gridCol w:w="4910"/>
+      </w:tblGrid>
+      <w:tr>
+        <w:tc>
+          <w:tcPr>
+            <w:tcW w:type="dxa" w:w="4910"/>
+            <w:vAlign w:val="center"/>
+          </w:tcPr>
+          <w:p>
+            <w:r>
+              <w:t>番号</w:t>
+            </w:r>
+          </w:p>
+        </w:tc>
+        <w:tc>
+          <w:tcPr>
+            <w:tcW w:type="dxa" w:w="4910"/>
+            <w:vAlign w:val="center"/>
+          </w:tcPr>
+          <w:p>
+            <w:r>
+              <w:t>領域と操作</w:t>
+            </w:r>
+          </w:p>
+        </w:tc>
+      </w:tr>
+      <w:tr>
+        <w:tc>
+          <w:tcPr>
+            <w:tcW w:type="dxa" w:w="4910"/>
+            <w:vAlign w:val="center"/>
+          </w:tcPr>
+          <w:p>
+            <w:r>
+              <w:t>1</w:t>
+            </w:r>
+          </w:p>
+        </w:tc>
+        <w:tc>
+          <w:tcPr>
+            <w:tcW w:type="dxa" w:w="4910"/>
+            <w:vAlign w:val="center"/>
+          </w:tcPr>
+          <w:p>
+            <w:r>
+              <w:t>時刻領域：12時間表示と24時間表示を切り替える。</w:t>
+            </w:r>
+          </w:p>
+        </w:tc>
+      </w:tr>
+      <w:tr>
+        <w:tc>
+          <w:tcPr>
+            <w:tcW w:type="dxa" w:w="4910"/>
+            <w:vAlign w:val="center"/>
+          </w:tcPr>
+          <w:p>
+            <w:r>
+              <w:t>2</w:t>
+            </w:r>
+          </w:p>
+        </w:tc>
+        <w:tc>
+          <w:tcPr>
+            <w:tcW w:type="dxa" w:w="4910"/>
+            <w:vAlign w:val="center"/>
+          </w:tcPr>
+          <w:p>
+            <w:r>
+              <w:t>天気アイコン：テーマを切り替える。</w:t>
+            </w:r>
+          </w:p>
+        </w:tc>
+      </w:tr>
+      <w:tr>
+        <w:tc>
+          <w:tcPr>
+            <w:tcW w:type="dxa" w:w="4910"/>
+            <w:vAlign w:val="center"/>
+          </w:tcPr>
+          <w:p>
+            <w:r>
+              <w:t>3</w:t>
+            </w:r>
+          </w:p>
+        </w:tc>
+        <w:tc>
+          <w:tcPr>
+            <w:tcW w:type="dxa" w:w="4910"/>
+            <w:vAlign w:val="center"/>
+          </w:tcPr>
+          <w:p>
+            <w:r>
+              <w:t>日付領域：カレンダーを開く。</w:t>
+            </w:r>
+          </w:p>
+        </w:tc>
+      </w:tr>
+      <w:tr>
+        <w:tc>
+          <w:tcPr>
+            <w:tcW w:type="dxa" w:w="4910"/>
+            <w:vAlign w:val="center"/>
+          </w:tcPr>
+          <w:p>
+            <w:r>
+              <w:t>4</w:t>
+            </w:r>
+          </w:p>
+        </w:tc>
+        <w:tc>
+          <w:tcPr>
+            <w:tcW w:type="dxa" w:w="4910"/>
+            <w:vAlign w:val="center"/>
+          </w:tcPr>
+          <w:p>
+            <w:r>
+              <w:t>室内値：SHT20 → AHT21 → SwitchBot → BME280 の順で有効な情報源を切り替える。</w:t>
+            </w:r>
+          </w:p>
+        </w:tc>
+      </w:tr>
+      <w:tr>
+        <w:tc>
+          <w:tcPr>
+            <w:tcW w:type="dxa" w:w="4910"/>
+            <w:vAlign w:val="center"/>
+          </w:tcPr>
+          <w:p>
+            <w:r>
+              <w:t>5</w:t>
+            </w:r>
+          </w:p>
+        </w:tc>
+        <w:tc>
+          <w:tcPr>
+            <w:tcW w:type="dxa" w:w="4910"/>
+            <w:vAlign w:val="center"/>
+          </w:tcPr>
+          <w:p>
+            <w:r>
+              <w:t>左の空気値：eCO2 と気圧を切り替える。</w:t>
+            </w:r>
+          </w:p>
+        </w:tc>
+      </w:tr>
+      <w:tr>
+        <w:tc>
+          <w:tcPr>
+            <w:tcW w:type="dxa" w:w="4910"/>
+            <w:vAlign w:val="center"/>
+          </w:tcPr>
+          <w:p>
+            <w:r>
+              <w:t>6</w:t>
+            </w:r>
+          </w:p>
+        </w:tc>
+        <w:tc>
+          <w:tcPr>
+            <w:tcW w:type="dxa" w:w="4910"/>
+            <w:vAlign w:val="center"/>
+          </w:tcPr>
+          <w:p>
+            <w:r>
+              <w:t>右の空気値：TVOC と CO2 を切り替える。</w:t>
+            </w:r>
+          </w:p>
+        </w:tc>
+      </w:tr>
+      <w:tr>
+        <w:tc>
+          <w:tcPr>
+            <w:tcW w:type="dxa" w:w="4910"/>
+            <w:vAlign w:val="center"/>
+          </w:tcPr>
+          <w:p>
+            <w:r>
+              <w:t>7</w:t>
+            </w:r>
+          </w:p>
+        </w:tc>
+        <w:tc>
+          <w:tcPr>
+            <w:tcW w:type="dxa" w:w="4910"/>
+            <w:vAlign w:val="center"/>
+          </w:tcPr>
+          <w:p>
+            <w:r>
+              <w:t>室外値：SwitchBot と Open-Meteo を切り替える。</w:t>
+            </w:r>
+          </w:p>
+        </w:tc>
+      </w:tr>
+    </w:tbl>
+    <w:p>
+      <w:r>
+        <w:t>補足：カレンダー表示中は前月・翌月の操作を最優先し、それ以外のタップで閉じる。表示OFF中はMOUSE/FINGER入力を受け付けず、前回の押下状態を復帰後へ持ち越さない。</w:t>
       </w:r>
     </w:p>
     <w:p>

</xml_diff>

<commit_message>
docs: correct time touch region map
</commit_message>
<xml_diff>
--- a/documents/DeskSideClock_基本設計書_v2.4.0.docx
+++ b/documents/DeskSideClock_基本設計書_v2.4.0.docx
@@ -10874,7 +10874,7 @@
         <w:drawing>
           <wp:inline xmlns:a="http://schemas.openxmlformats.org/drawingml/2006/main" xmlns:pic="http://schemas.openxmlformats.org/drawingml/2006/picture">
             <wp:extent cx="5623560" cy="3514725"/>
-            <wp:docPr id="1" name="Picture 1" descr="momoRB5 実機画面キャプチャに現在のタッチ操作領域を色分けして重ねた図"/>
+            <wp:docPr id="1" name="Picture 1" descr="momoRB5実機画面キャプチャに、実装から算出したタッチ操作領域を色分けして重ねた図"/>
             <wp:cNvGraphicFramePr>
               <a:graphicFrameLocks noChangeAspect="1"/>
             </wp:cNvGraphicFramePr>
@@ -10886,7 +10886,7 @@
                     <pic:cNvPicPr/>
                   </pic:nvPicPr>
                   <pic:blipFill>
-                    <a:blip r:embed="rId13"/>
+                    <a:blip r:embed="rId14"/>
                     <a:stretch>
                       <a:fillRect/>
                     </a:stretch>
@@ -10968,7 +10968,7 @@
           </w:tcPr>
           <w:p>
             <w:r>
-              <w:t>時刻領域：12時間表示と24時間表示を切り替える。</w:t>
+              <w:t>時刻領域：午前／午後表示と時の2桁だけで、12時間表示と24時間表示を切り替える。分・秒は操作領域に含まない。</w:t>
             </w:r>
           </w:p>
         </w:tc>

</xml_diff>

<commit_message>
docs: align time touch map with display scaling
</commit_message>
<xml_diff>
--- a/documents/DeskSideClock_基本設計書_v2.4.0.docx
+++ b/documents/DeskSideClock_基本設計書_v2.4.0.docx
@@ -10874,7 +10874,7 @@
         <w:drawing>
           <wp:inline xmlns:a="http://schemas.openxmlformats.org/drawingml/2006/main" xmlns:pic="http://schemas.openxmlformats.org/drawingml/2006/picture">
             <wp:extent cx="5623560" cy="3514725"/>
-            <wp:docPr id="1" name="Picture 1" descr="momoRB5実機画面キャプチャに、実装から算出したタッチ操作領域を色分けして重ねた図"/>
+            <wp:docPr id="1" name="Picture 1" descr="momoRB5実機画面キャプチャに、UI_SCALEを反映して算出したタッチ操作領域を色分けして重ねた図"/>
             <wp:cNvGraphicFramePr>
               <a:graphicFrameLocks noChangeAspect="1"/>
             </wp:cNvGraphicFramePr>
@@ -10886,7 +10886,7 @@
                     <pic:cNvPicPr/>
                   </pic:nvPicPr>
                   <pic:blipFill>
-                    <a:blip r:embed="rId14"/>
+                    <a:blip r:embed="rId15"/>
                     <a:stretch>
                       <a:fillRect/>
                     </a:stretch>
@@ -10968,7 +10968,7 @@
           </w:tcPr>
           <w:p>
             <w:r>
-              <w:t>時刻領域：午前／午後表示と時の2桁だけで、12時間表示と24時間表示を切り替える。分・秒は操作領域に含まない。</w:t>
+              <w:t>時刻領域：午前／午後表示と時の2桁だけで、12時間表示と24時間表示を切り替える。1920×1200実機画面では x=62, y=233, 幅=745, 高さ=396。分・秒は操作領域に含まない。</w:t>
             </w:r>
           </w:p>
         </w:tc>

</xml_diff>

<commit_message>
docs: align touch section page flow and table style
</commit_message>
<xml_diff>
--- a/documents/DeskSideClock_基本設計書_v2.4.0.docx
+++ b/documents/DeskSideClock_基本設計書_v2.4.0.docx
@@ -10841,7 +10841,7 @@
     <w:p>
       <w:pPr>
         <w:pStyle w:val="Heading2"/>
-        <w:pageBreakBefore/>
+        <w:pageBreakBefore w:val="0"/>
       </w:pPr>
       <w:bookmarkStart w:id="27" w:name="_Toc238979268"/>
       <w:r>
@@ -10917,34 +10917,102 @@
     <w:tbl>
       <w:tblPr>
         <w:tblStyle w:val="TableGrid"/>
-        <w:tblW w:type="auto" w:w="0"/>
-        <w:jc w:val="center"/>
+        <w:tblW w:type="dxa" w:w="9360"/>
+        <w:jc w:val="left"/>
+        <w:tblLayout w:type="fixed"/>
         <w:tblLook w:firstColumn="1" w:firstRow="1" w:lastColumn="0" w:lastRow="0" w:noHBand="0" w:noVBand="1" w:val="04A0"/>
+        <w:tblInd w:w="120" w:type="dxa"/>
       </w:tblPr>
       <w:tblGrid>
-        <w:gridCol w:w="4910"/>
-        <w:gridCol w:w="4910"/>
+        <w:gridCol w:w="2500"/>
+        <w:gridCol w:w="1700"/>
+        <w:gridCol w:w="5160"/>
       </w:tblGrid>
       <w:tr>
-        <w:tc>
-          <w:tcPr>
-            <w:tcW w:type="dxa" w:w="4910"/>
-            <w:vAlign w:val="center"/>
-          </w:tcPr>
-          <w:p>
-            <w:r>
+        <w:trPr>
+          <w:tblHeader w:val="true"/>
+        </w:trPr>
+        <w:tc>
+          <w:tcPr>
+            <w:tcW w:type="dxa" w:w="2500"/>
+            <w:tcMar>
+              <w:top w:w="90" w:type="dxa"/>
+              <w:start w:w="120" w:type="dxa"/>
+              <w:bottom w:w="90" w:type="dxa"/>
+              <w:end w:w="120" w:type="dxa"/>
+            </w:tcMar>
+            <w:vAlign w:val="center"/>
+            <w:shd w:fill="1F4E78"/>
+          </w:tcPr>
+          <w:p>
+            <w:pPr>
+              <w:spacing w:after="0" w:line="259" w:lineRule="auto"/>
+              <w:jc w:val="center"/>
+            </w:pPr>
+            <w:r>
+              <w:rPr>
+                <w:rFonts w:ascii="Arial" w:hAnsi="Arial" w:eastAsia="Noto Sans JP"/>
+                <w:b/>
+                <w:color w:val="FFFFFF"/>
+                <w:sz w:val="17"/>
+              </w:rPr>
               <w:t>番号</w:t>
             </w:r>
           </w:p>
         </w:tc>
         <w:tc>
           <w:tcPr>
-            <w:tcW w:type="dxa" w:w="4910"/>
-            <w:vAlign w:val="center"/>
-          </w:tcPr>
-          <w:p>
-            <w:r>
-              <w:t>領域と操作</w:t>
+            <w:tcW w:type="dxa" w:w="1700"/>
+            <w:tcMar>
+              <w:top w:w="90" w:type="dxa"/>
+              <w:start w:w="120" w:type="dxa"/>
+              <w:bottom w:w="90" w:type="dxa"/>
+              <w:end w:w="120" w:type="dxa"/>
+            </w:tcMar>
+            <w:vAlign w:val="center"/>
+            <w:shd w:fill="1F4E78"/>
+          </w:tcPr>
+          <w:p>
+            <w:pPr>
+              <w:spacing w:after="0" w:line="259" w:lineRule="auto"/>
+              <w:jc w:val="center"/>
+            </w:pPr>
+            <w:r>
+              <w:rPr>
+                <w:rFonts w:ascii="Arial" w:hAnsi="Arial" w:eastAsia="Noto Sans JP"/>
+                <w:b/>
+                <w:color w:val="FFFFFF"/>
+                <w:sz w:val="17"/>
+              </w:rPr>
+              <w:t>領域</w:t>
+            </w:r>
+          </w:p>
+        </w:tc>
+        <w:tc>
+          <w:tcPr>
+            <w:tcW w:type="dxa" w:w="5160"/>
+            <w:tcMar>
+              <w:top w:w="90" w:type="dxa"/>
+              <w:start w:w="120" w:type="dxa"/>
+              <w:bottom w:w="90" w:type="dxa"/>
+              <w:end w:w="120" w:type="dxa"/>
+            </w:tcMar>
+            <w:vAlign w:val="center"/>
+            <w:shd w:fill="1F4E78"/>
+          </w:tcPr>
+          <w:p>
+            <w:pPr>
+              <w:spacing w:after="0" w:line="259" w:lineRule="auto"/>
+              <w:jc w:val="center"/>
+            </w:pPr>
+            <w:r>
+              <w:rPr>
+                <w:rFonts w:ascii="Arial" w:hAnsi="Arial" w:eastAsia="Noto Sans JP"/>
+                <w:b/>
+                <w:color w:val="FFFFFF"/>
+                <w:sz w:val="17"/>
+              </w:rPr>
+              <w:t>操作</w:t>
             </w:r>
           </w:p>
         </w:tc>
@@ -10952,23 +11020,73 @@
       <w:tr>
         <w:tc>
           <w:tcPr>
-            <w:tcW w:type="dxa" w:w="4910"/>
-            <w:vAlign w:val="center"/>
-          </w:tcPr>
-          <w:p>
-            <w:r>
+            <w:tcW w:type="dxa" w:w="2500"/>
+            <w:tcMar>
+              <w:top w:w="90" w:type="dxa"/>
+              <w:start w:w="120" w:type="dxa"/>
+              <w:bottom w:w="90" w:type="dxa"/>
+              <w:end w:w="120" w:type="dxa"/>
+            </w:tcMar>
+            <w:vAlign w:val="center"/>
+          </w:tcPr>
+          <w:p>
+            <w:pPr>
+              <w:spacing w:after="0" w:line="259" w:lineRule="auto"/>
+            </w:pPr>
+            <w:r>
+              <w:rPr>
+                <w:rFonts w:ascii="Arial" w:hAnsi="Arial" w:eastAsia="Noto Sans JP"/>
+                <w:sz w:val="17"/>
+              </w:rPr>
               <w:t>1</w:t>
             </w:r>
           </w:p>
         </w:tc>
         <w:tc>
           <w:tcPr>
-            <w:tcW w:type="dxa" w:w="4910"/>
-            <w:vAlign w:val="center"/>
-          </w:tcPr>
-          <w:p>
-            <w:r>
-              <w:t>時刻領域：午前／午後表示と時の2桁だけで、12時間表示と24時間表示を切り替える。1920×1200実機画面では x=62, y=233, 幅=745, 高さ=396。分・秒は操作領域に含まない。</w:t>
+            <w:tcW w:type="dxa" w:w="1700"/>
+            <w:tcMar>
+              <w:top w:w="90" w:type="dxa"/>
+              <w:start w:w="120" w:type="dxa"/>
+              <w:bottom w:w="90" w:type="dxa"/>
+              <w:end w:w="120" w:type="dxa"/>
+            </w:tcMar>
+            <w:vAlign w:val="center"/>
+          </w:tcPr>
+          <w:p>
+            <w:pPr>
+              <w:spacing w:after="0" w:line="259" w:lineRule="auto"/>
+            </w:pPr>
+            <w:r>
+              <w:rPr>
+                <w:rFonts w:ascii="Arial" w:hAnsi="Arial" w:eastAsia="Noto Sans JP"/>
+                <w:sz w:val="17"/>
+              </w:rPr>
+              <w:t>午前／午後 + 時</w:t>
+            </w:r>
+          </w:p>
+        </w:tc>
+        <w:tc>
+          <w:tcPr>
+            <w:tcW w:type="dxa" w:w="5160"/>
+            <w:tcMar>
+              <w:top w:w="90" w:type="dxa"/>
+              <w:start w:w="120" w:type="dxa"/>
+              <w:bottom w:w="90" w:type="dxa"/>
+              <w:end w:w="120" w:type="dxa"/>
+            </w:tcMar>
+            <w:vAlign w:val="center"/>
+          </w:tcPr>
+          <w:p>
+            <w:pPr>
+              <w:spacing w:after="0" w:line="259" w:lineRule="auto"/>
+            </w:pPr>
+            <w:r>
+              <w:rPr>
+                <w:rFonts w:ascii="Arial" w:hAnsi="Arial" w:eastAsia="Noto Sans JP"/>
+                <w:sz w:val="17"/>
+              </w:rPr>
+              <w:t>12時間表示と24時間表示を切替。実機1920×1200では x=62, y=233, 幅=745, 高さ=396。分・秒は対象外。</w:t>
             </w:r>
           </w:p>
         </w:tc>
@@ -10976,23 +11094,76 @@
       <w:tr>
         <w:tc>
           <w:tcPr>
-            <w:tcW w:type="dxa" w:w="4910"/>
-            <w:vAlign w:val="center"/>
-          </w:tcPr>
-          <w:p>
-            <w:r>
+            <w:tcW w:type="dxa" w:w="2500"/>
+            <w:tcMar>
+              <w:top w:w="90" w:type="dxa"/>
+              <w:start w:w="120" w:type="dxa"/>
+              <w:bottom w:w="90" w:type="dxa"/>
+              <w:end w:w="120" w:type="dxa"/>
+            </w:tcMar>
+            <w:vAlign w:val="center"/>
+            <w:shd w:fill="F8FAFC"/>
+          </w:tcPr>
+          <w:p>
+            <w:pPr>
+              <w:spacing w:after="0" w:line="259" w:lineRule="auto"/>
+            </w:pPr>
+            <w:r>
+              <w:rPr>
+                <w:rFonts w:ascii="Arial" w:hAnsi="Arial" w:eastAsia="Noto Sans JP"/>
+                <w:sz w:val="17"/>
+              </w:rPr>
               <w:t>2</w:t>
             </w:r>
           </w:p>
         </w:tc>
         <w:tc>
           <w:tcPr>
-            <w:tcW w:type="dxa" w:w="4910"/>
-            <w:vAlign w:val="center"/>
-          </w:tcPr>
-          <w:p>
-            <w:r>
-              <w:t>天気アイコン：テーマを切り替える。</w:t>
+            <w:tcW w:type="dxa" w:w="1700"/>
+            <w:tcMar>
+              <w:top w:w="90" w:type="dxa"/>
+              <w:start w:w="120" w:type="dxa"/>
+              <w:bottom w:w="90" w:type="dxa"/>
+              <w:end w:w="120" w:type="dxa"/>
+            </w:tcMar>
+            <w:vAlign w:val="center"/>
+            <w:shd w:fill="F8FAFC"/>
+          </w:tcPr>
+          <w:p>
+            <w:pPr>
+              <w:spacing w:after="0" w:line="259" w:lineRule="auto"/>
+            </w:pPr>
+            <w:r>
+              <w:rPr>
+                <w:rFonts w:ascii="Arial" w:hAnsi="Arial" w:eastAsia="Noto Sans JP"/>
+                <w:sz w:val="17"/>
+              </w:rPr>
+              <w:t>天気アイコン</w:t>
+            </w:r>
+          </w:p>
+        </w:tc>
+        <w:tc>
+          <w:tcPr>
+            <w:tcW w:type="dxa" w:w="5160"/>
+            <w:tcMar>
+              <w:top w:w="90" w:type="dxa"/>
+              <w:start w:w="120" w:type="dxa"/>
+              <w:bottom w:w="90" w:type="dxa"/>
+              <w:end w:w="120" w:type="dxa"/>
+            </w:tcMar>
+            <w:vAlign w:val="center"/>
+            <w:shd w:fill="F8FAFC"/>
+          </w:tcPr>
+          <w:p>
+            <w:pPr>
+              <w:spacing w:after="0" w:line="259" w:lineRule="auto"/>
+            </w:pPr>
+            <w:r>
+              <w:rPr>
+                <w:rFonts w:ascii="Arial" w:hAnsi="Arial" w:eastAsia="Noto Sans JP"/>
+                <w:sz w:val="17"/>
+              </w:rPr>
+              <w:t>テーマを切替。</w:t>
             </w:r>
           </w:p>
         </w:tc>
@@ -11000,23 +11171,73 @@
       <w:tr>
         <w:tc>
           <w:tcPr>
-            <w:tcW w:type="dxa" w:w="4910"/>
-            <w:vAlign w:val="center"/>
-          </w:tcPr>
-          <w:p>
-            <w:r>
+            <w:tcW w:type="dxa" w:w="2500"/>
+            <w:tcMar>
+              <w:top w:w="90" w:type="dxa"/>
+              <w:start w:w="120" w:type="dxa"/>
+              <w:bottom w:w="90" w:type="dxa"/>
+              <w:end w:w="120" w:type="dxa"/>
+            </w:tcMar>
+            <w:vAlign w:val="center"/>
+          </w:tcPr>
+          <w:p>
+            <w:pPr>
+              <w:spacing w:after="0" w:line="259" w:lineRule="auto"/>
+            </w:pPr>
+            <w:r>
+              <w:rPr>
+                <w:rFonts w:ascii="Arial" w:hAnsi="Arial" w:eastAsia="Noto Sans JP"/>
+                <w:sz w:val="17"/>
+              </w:rPr>
               <w:t>3</w:t>
             </w:r>
           </w:p>
         </w:tc>
         <w:tc>
           <w:tcPr>
-            <w:tcW w:type="dxa" w:w="4910"/>
-            <w:vAlign w:val="center"/>
-          </w:tcPr>
-          <w:p>
-            <w:r>
-              <w:t>日付領域：カレンダーを開く。</w:t>
+            <w:tcW w:type="dxa" w:w="1700"/>
+            <w:tcMar>
+              <w:top w:w="90" w:type="dxa"/>
+              <w:start w:w="120" w:type="dxa"/>
+              <w:bottom w:w="90" w:type="dxa"/>
+              <w:end w:w="120" w:type="dxa"/>
+            </w:tcMar>
+            <w:vAlign w:val="center"/>
+          </w:tcPr>
+          <w:p>
+            <w:pPr>
+              <w:spacing w:after="0" w:line="259" w:lineRule="auto"/>
+            </w:pPr>
+            <w:r>
+              <w:rPr>
+                <w:rFonts w:ascii="Arial" w:hAnsi="Arial" w:eastAsia="Noto Sans JP"/>
+                <w:sz w:val="17"/>
+              </w:rPr>
+              <w:t>日付</w:t>
+            </w:r>
+          </w:p>
+        </w:tc>
+        <w:tc>
+          <w:tcPr>
+            <w:tcW w:type="dxa" w:w="5160"/>
+            <w:tcMar>
+              <w:top w:w="90" w:type="dxa"/>
+              <w:start w:w="120" w:type="dxa"/>
+              <w:bottom w:w="90" w:type="dxa"/>
+              <w:end w:w="120" w:type="dxa"/>
+            </w:tcMar>
+            <w:vAlign w:val="center"/>
+          </w:tcPr>
+          <w:p>
+            <w:pPr>
+              <w:spacing w:after="0" w:line="259" w:lineRule="auto"/>
+            </w:pPr>
+            <w:r>
+              <w:rPr>
+                <w:rFonts w:ascii="Arial" w:hAnsi="Arial" w:eastAsia="Noto Sans JP"/>
+                <w:sz w:val="17"/>
+              </w:rPr>
+              <w:t>カレンダーを開く。</w:t>
             </w:r>
           </w:p>
         </w:tc>
@@ -11024,23 +11245,76 @@
       <w:tr>
         <w:tc>
           <w:tcPr>
-            <w:tcW w:type="dxa" w:w="4910"/>
-            <w:vAlign w:val="center"/>
-          </w:tcPr>
-          <w:p>
-            <w:r>
+            <w:tcW w:type="dxa" w:w="2500"/>
+            <w:tcMar>
+              <w:top w:w="90" w:type="dxa"/>
+              <w:start w:w="120" w:type="dxa"/>
+              <w:bottom w:w="90" w:type="dxa"/>
+              <w:end w:w="120" w:type="dxa"/>
+            </w:tcMar>
+            <w:vAlign w:val="center"/>
+            <w:shd w:fill="F8FAFC"/>
+          </w:tcPr>
+          <w:p>
+            <w:pPr>
+              <w:spacing w:after="0" w:line="259" w:lineRule="auto"/>
+            </w:pPr>
+            <w:r>
+              <w:rPr>
+                <w:rFonts w:ascii="Arial" w:hAnsi="Arial" w:eastAsia="Noto Sans JP"/>
+                <w:sz w:val="17"/>
+              </w:rPr>
               <w:t>4</w:t>
             </w:r>
           </w:p>
         </w:tc>
         <w:tc>
           <w:tcPr>
-            <w:tcW w:type="dxa" w:w="4910"/>
-            <w:vAlign w:val="center"/>
-          </w:tcPr>
-          <w:p>
-            <w:r>
-              <w:t>室内値：SHT20 → AHT21 → SwitchBot → BME280 の順で有効な情報源を切り替える。</w:t>
+            <w:tcW w:type="dxa" w:w="1700"/>
+            <w:tcMar>
+              <w:top w:w="90" w:type="dxa"/>
+              <w:start w:w="120" w:type="dxa"/>
+              <w:bottom w:w="90" w:type="dxa"/>
+              <w:end w:w="120" w:type="dxa"/>
+            </w:tcMar>
+            <w:vAlign w:val="center"/>
+            <w:shd w:fill="F8FAFC"/>
+          </w:tcPr>
+          <w:p>
+            <w:pPr>
+              <w:spacing w:after="0" w:line="259" w:lineRule="auto"/>
+            </w:pPr>
+            <w:r>
+              <w:rPr>
+                <w:rFonts w:ascii="Arial" w:hAnsi="Arial" w:eastAsia="Noto Sans JP"/>
+                <w:sz w:val="17"/>
+              </w:rPr>
+              <w:t>室内値</w:t>
+            </w:r>
+          </w:p>
+        </w:tc>
+        <w:tc>
+          <w:tcPr>
+            <w:tcW w:type="dxa" w:w="5160"/>
+            <w:tcMar>
+              <w:top w:w="90" w:type="dxa"/>
+              <w:start w:w="120" w:type="dxa"/>
+              <w:bottom w:w="90" w:type="dxa"/>
+              <w:end w:w="120" w:type="dxa"/>
+            </w:tcMar>
+            <w:vAlign w:val="center"/>
+            <w:shd w:fill="F8FAFC"/>
+          </w:tcPr>
+          <w:p>
+            <w:pPr>
+              <w:spacing w:after="0" w:line="259" w:lineRule="auto"/>
+            </w:pPr>
+            <w:r>
+              <w:rPr>
+                <w:rFonts w:ascii="Arial" w:hAnsi="Arial" w:eastAsia="Noto Sans JP"/>
+                <w:sz w:val="17"/>
+              </w:rPr>
+              <w:t>SHT20 → AHT21 → SwitchBot → BME280 の順で有効な情報源を切替。</w:t>
             </w:r>
           </w:p>
         </w:tc>
@@ -11048,23 +11322,73 @@
       <w:tr>
         <w:tc>
           <w:tcPr>
-            <w:tcW w:type="dxa" w:w="4910"/>
-            <w:vAlign w:val="center"/>
-          </w:tcPr>
-          <w:p>
-            <w:r>
+            <w:tcW w:type="dxa" w:w="2500"/>
+            <w:tcMar>
+              <w:top w:w="90" w:type="dxa"/>
+              <w:start w:w="120" w:type="dxa"/>
+              <w:bottom w:w="90" w:type="dxa"/>
+              <w:end w:w="120" w:type="dxa"/>
+            </w:tcMar>
+            <w:vAlign w:val="center"/>
+          </w:tcPr>
+          <w:p>
+            <w:pPr>
+              <w:spacing w:after="0" w:line="259" w:lineRule="auto"/>
+            </w:pPr>
+            <w:r>
+              <w:rPr>
+                <w:rFonts w:ascii="Arial" w:hAnsi="Arial" w:eastAsia="Noto Sans JP"/>
+                <w:sz w:val="17"/>
+              </w:rPr>
               <w:t>5</w:t>
             </w:r>
           </w:p>
         </w:tc>
         <w:tc>
           <w:tcPr>
-            <w:tcW w:type="dxa" w:w="4910"/>
-            <w:vAlign w:val="center"/>
-          </w:tcPr>
-          <w:p>
-            <w:r>
-              <w:t>左の空気値：eCO2 と気圧を切り替える。</w:t>
+            <w:tcW w:type="dxa" w:w="1700"/>
+            <w:tcMar>
+              <w:top w:w="90" w:type="dxa"/>
+              <w:start w:w="120" w:type="dxa"/>
+              <w:bottom w:w="90" w:type="dxa"/>
+              <w:end w:w="120" w:type="dxa"/>
+            </w:tcMar>
+            <w:vAlign w:val="center"/>
+          </w:tcPr>
+          <w:p>
+            <w:pPr>
+              <w:spacing w:after="0" w:line="259" w:lineRule="auto"/>
+            </w:pPr>
+            <w:r>
+              <w:rPr>
+                <w:rFonts w:ascii="Arial" w:hAnsi="Arial" w:eastAsia="Noto Sans JP"/>
+                <w:sz w:val="17"/>
+              </w:rPr>
+              <w:t>左の空気値</w:t>
+            </w:r>
+          </w:p>
+        </w:tc>
+        <w:tc>
+          <w:tcPr>
+            <w:tcW w:type="dxa" w:w="5160"/>
+            <w:tcMar>
+              <w:top w:w="90" w:type="dxa"/>
+              <w:start w:w="120" w:type="dxa"/>
+              <w:bottom w:w="90" w:type="dxa"/>
+              <w:end w:w="120" w:type="dxa"/>
+            </w:tcMar>
+            <w:vAlign w:val="center"/>
+          </w:tcPr>
+          <w:p>
+            <w:pPr>
+              <w:spacing w:after="0" w:line="259" w:lineRule="auto"/>
+            </w:pPr>
+            <w:r>
+              <w:rPr>
+                <w:rFonts w:ascii="Arial" w:hAnsi="Arial" w:eastAsia="Noto Sans JP"/>
+                <w:sz w:val="17"/>
+              </w:rPr>
+              <w:t>eCO2 と気圧を切替。</w:t>
             </w:r>
           </w:p>
         </w:tc>
@@ -11072,23 +11396,76 @@
       <w:tr>
         <w:tc>
           <w:tcPr>
-            <w:tcW w:type="dxa" w:w="4910"/>
-            <w:vAlign w:val="center"/>
-          </w:tcPr>
-          <w:p>
-            <w:r>
+            <w:tcW w:type="dxa" w:w="2500"/>
+            <w:tcMar>
+              <w:top w:w="90" w:type="dxa"/>
+              <w:start w:w="120" w:type="dxa"/>
+              <w:bottom w:w="90" w:type="dxa"/>
+              <w:end w:w="120" w:type="dxa"/>
+            </w:tcMar>
+            <w:vAlign w:val="center"/>
+            <w:shd w:fill="F8FAFC"/>
+          </w:tcPr>
+          <w:p>
+            <w:pPr>
+              <w:spacing w:after="0" w:line="259" w:lineRule="auto"/>
+            </w:pPr>
+            <w:r>
+              <w:rPr>
+                <w:rFonts w:ascii="Arial" w:hAnsi="Arial" w:eastAsia="Noto Sans JP"/>
+                <w:sz w:val="17"/>
+              </w:rPr>
               <w:t>6</w:t>
             </w:r>
           </w:p>
         </w:tc>
         <w:tc>
           <w:tcPr>
-            <w:tcW w:type="dxa" w:w="4910"/>
-            <w:vAlign w:val="center"/>
-          </w:tcPr>
-          <w:p>
-            <w:r>
-              <w:t>右の空気値：TVOC と CO2 を切り替える。</w:t>
+            <w:tcW w:type="dxa" w:w="1700"/>
+            <w:tcMar>
+              <w:top w:w="90" w:type="dxa"/>
+              <w:start w:w="120" w:type="dxa"/>
+              <w:bottom w:w="90" w:type="dxa"/>
+              <w:end w:w="120" w:type="dxa"/>
+            </w:tcMar>
+            <w:vAlign w:val="center"/>
+            <w:shd w:fill="F8FAFC"/>
+          </w:tcPr>
+          <w:p>
+            <w:pPr>
+              <w:spacing w:after="0" w:line="259" w:lineRule="auto"/>
+            </w:pPr>
+            <w:r>
+              <w:rPr>
+                <w:rFonts w:ascii="Arial" w:hAnsi="Arial" w:eastAsia="Noto Sans JP"/>
+                <w:sz w:val="17"/>
+              </w:rPr>
+              <w:t>右の空気値</w:t>
+            </w:r>
+          </w:p>
+        </w:tc>
+        <w:tc>
+          <w:tcPr>
+            <w:tcW w:type="dxa" w:w="5160"/>
+            <w:tcMar>
+              <w:top w:w="90" w:type="dxa"/>
+              <w:start w:w="120" w:type="dxa"/>
+              <w:bottom w:w="90" w:type="dxa"/>
+              <w:end w:w="120" w:type="dxa"/>
+            </w:tcMar>
+            <w:vAlign w:val="center"/>
+            <w:shd w:fill="F8FAFC"/>
+          </w:tcPr>
+          <w:p>
+            <w:pPr>
+              <w:spacing w:after="0" w:line="259" w:lineRule="auto"/>
+            </w:pPr>
+            <w:r>
+              <w:rPr>
+                <w:rFonts w:ascii="Arial" w:hAnsi="Arial" w:eastAsia="Noto Sans JP"/>
+                <w:sz w:val="17"/>
+              </w:rPr>
+              <w:t>TVOC と CO2 を切替。</w:t>
             </w:r>
           </w:p>
         </w:tc>
@@ -11096,23 +11473,73 @@
       <w:tr>
         <w:tc>
           <w:tcPr>
-            <w:tcW w:type="dxa" w:w="4910"/>
-            <w:vAlign w:val="center"/>
-          </w:tcPr>
-          <w:p>
-            <w:r>
+            <w:tcW w:type="dxa" w:w="2500"/>
+            <w:tcMar>
+              <w:top w:w="90" w:type="dxa"/>
+              <w:start w:w="120" w:type="dxa"/>
+              <w:bottom w:w="90" w:type="dxa"/>
+              <w:end w:w="120" w:type="dxa"/>
+            </w:tcMar>
+            <w:vAlign w:val="center"/>
+          </w:tcPr>
+          <w:p>
+            <w:pPr>
+              <w:spacing w:after="0" w:line="259" w:lineRule="auto"/>
+            </w:pPr>
+            <w:r>
+              <w:rPr>
+                <w:rFonts w:ascii="Arial" w:hAnsi="Arial" w:eastAsia="Noto Sans JP"/>
+                <w:sz w:val="17"/>
+              </w:rPr>
               <w:t>7</w:t>
             </w:r>
           </w:p>
         </w:tc>
         <w:tc>
           <w:tcPr>
-            <w:tcW w:type="dxa" w:w="4910"/>
-            <w:vAlign w:val="center"/>
-          </w:tcPr>
-          <w:p>
-            <w:r>
-              <w:t>室外値：SwitchBot と Open-Meteo を切り替える。</w:t>
+            <w:tcW w:type="dxa" w:w="1700"/>
+            <w:tcMar>
+              <w:top w:w="90" w:type="dxa"/>
+              <w:start w:w="120" w:type="dxa"/>
+              <w:bottom w:w="90" w:type="dxa"/>
+              <w:end w:w="120" w:type="dxa"/>
+            </w:tcMar>
+            <w:vAlign w:val="center"/>
+          </w:tcPr>
+          <w:p>
+            <w:pPr>
+              <w:spacing w:after="0" w:line="259" w:lineRule="auto"/>
+            </w:pPr>
+            <w:r>
+              <w:rPr>
+                <w:rFonts w:ascii="Arial" w:hAnsi="Arial" w:eastAsia="Noto Sans JP"/>
+                <w:sz w:val="17"/>
+              </w:rPr>
+              <w:t>室外値</w:t>
+            </w:r>
+          </w:p>
+        </w:tc>
+        <w:tc>
+          <w:tcPr>
+            <w:tcW w:type="dxa" w:w="5160"/>
+            <w:tcMar>
+              <w:top w:w="90" w:type="dxa"/>
+              <w:start w:w="120" w:type="dxa"/>
+              <w:bottom w:w="90" w:type="dxa"/>
+              <w:end w:w="120" w:type="dxa"/>
+            </w:tcMar>
+            <w:vAlign w:val="center"/>
+          </w:tcPr>
+          <w:p>
+            <w:pPr>
+              <w:spacing w:after="0" w:line="259" w:lineRule="auto"/>
+            </w:pPr>
+            <w:r>
+              <w:rPr>
+                <w:rFonts w:ascii="Arial" w:hAnsi="Arial" w:eastAsia="Noto Sans JP"/>
+                <w:sz w:val="17"/>
+              </w:rPr>
+              <w:t>SwitchBot と Open-Meteo を切替。</w:t>
             </w:r>
           </w:p>
         </w:tc>

</xml_diff>